<commit_message>
EHIS-4993, EHIS-4705, Topic Type
</commit_message>
<xml_diff>
--- a/PHOCS-Docgentemplates/PHOCS Temp Food Premise Permit Template_v4.docx
+++ b/PHOCS-Docgentemplates/PHOCS Temp Food Premise Permit Template_v4.docx
@@ -49,29 +49,7 @@
                 <w:sz w:val="24"/>
                 <w:szCs w:val="24"/>
               </w:rPr>
-              <w:t>{{#NameOfEvent</w:t>
-            </w:r>
-            <w:proofErr w:type="gramStart"/>
-            <w:r>
-              <w:rPr>
-                <w:rFonts w:ascii="BC Sans" w:hAnsi="BC Sans"/>
-                <w:b/>
-                <w:bCs/>
-                <w:sz w:val="24"/>
-                <w:szCs w:val="24"/>
-              </w:rPr>
-              <w:t>}}Name</w:t>
-            </w:r>
-            <w:proofErr w:type="gramEnd"/>
-            <w:r>
-              <w:rPr>
-                <w:rFonts w:ascii="BC Sans" w:hAnsi="BC Sans"/>
-                <w:b/>
-                <w:bCs/>
-                <w:sz w:val="24"/>
-                <w:szCs w:val="24"/>
-              </w:rPr>
-              <w:t xml:space="preserve"> of Event:</w:t>
+              <w:t>{{#NameOfEvent}}Name of Event:</w:t>
             </w:r>
           </w:p>
         </w:tc>
@@ -113,23 +91,13 @@
               <w:t>NameOfEvent</w:t>
             </w:r>
             <w:proofErr w:type="spellEnd"/>
-            <w:proofErr w:type="gramStart"/>
             <w:r>
               <w:rPr>
                 <w:rFonts w:ascii="BC Sans" w:hAnsi="BC Sans"/>
                 <w:sz w:val="24"/>
                 <w:szCs w:val="24"/>
               </w:rPr>
-              <w:t>}}{</w:t>
-            </w:r>
-            <w:proofErr w:type="gramEnd"/>
-            <w:r>
-              <w:rPr>
-                <w:rFonts w:ascii="BC Sans" w:hAnsi="BC Sans"/>
-                <w:sz w:val="24"/>
-                <w:szCs w:val="24"/>
-              </w:rPr>
-              <w:t>{/</w:t>
+              <w:t>}}{{/</w:t>
             </w:r>
             <w:proofErr w:type="spellStart"/>
             <w:r>
@@ -196,29 +164,7 @@
                 <w:sz w:val="24"/>
                 <w:szCs w:val="24"/>
               </w:rPr>
-              <w:t>{{#EventLocationName</w:t>
-            </w:r>
-            <w:proofErr w:type="gramStart"/>
-            <w:r>
-              <w:rPr>
-                <w:rFonts w:ascii="BC Sans" w:hAnsi="BC Sans"/>
-                <w:b/>
-                <w:bCs/>
-                <w:sz w:val="24"/>
-                <w:szCs w:val="24"/>
-              </w:rPr>
-              <w:t>}}Event</w:t>
-            </w:r>
-            <w:proofErr w:type="gramEnd"/>
-            <w:r>
-              <w:rPr>
-                <w:rFonts w:ascii="BC Sans" w:hAnsi="BC Sans"/>
-                <w:b/>
-                <w:bCs/>
-                <w:sz w:val="24"/>
-                <w:szCs w:val="24"/>
-              </w:rPr>
-              <w:t xml:space="preserve"> Location Name:</w:t>
+              <w:t>{{#EventLocationName}}Event Location Name:</w:t>
             </w:r>
           </w:p>
           <w:p>
@@ -261,23 +207,13 @@
               <w:t>EventLocationName</w:t>
             </w:r>
             <w:proofErr w:type="spellEnd"/>
-            <w:proofErr w:type="gramStart"/>
             <w:r>
               <w:rPr>
                 <w:rFonts w:ascii="BC Sans" w:hAnsi="BC Sans"/>
                 <w:sz w:val="24"/>
                 <w:szCs w:val="24"/>
               </w:rPr>
-              <w:t>}}{</w:t>
-            </w:r>
-            <w:proofErr w:type="gramEnd"/>
-            <w:r>
-              <w:rPr>
-                <w:rFonts w:ascii="BC Sans" w:hAnsi="BC Sans"/>
-                <w:sz w:val="24"/>
-                <w:szCs w:val="24"/>
-              </w:rPr>
-              <w:t>{/</w:t>
+              <w:t>}}{{/</w:t>
             </w:r>
             <w:proofErr w:type="spellStart"/>
             <w:r>
@@ -327,29 +263,7 @@
                 <w:sz w:val="24"/>
                 <w:szCs w:val="24"/>
               </w:rPr>
-              <w:t>{{#EventAddressStreet</w:t>
-            </w:r>
-            <w:proofErr w:type="gramStart"/>
-            <w:r>
-              <w:rPr>
-                <w:rFonts w:ascii="BC Sans" w:hAnsi="BC Sans"/>
-                <w:b/>
-                <w:bCs/>
-                <w:sz w:val="24"/>
-                <w:szCs w:val="24"/>
-              </w:rPr>
-              <w:t>}}Event</w:t>
-            </w:r>
-            <w:proofErr w:type="gramEnd"/>
-            <w:r>
-              <w:rPr>
-                <w:rFonts w:ascii="BC Sans" w:hAnsi="BC Sans"/>
-                <w:b/>
-                <w:bCs/>
-                <w:sz w:val="24"/>
-                <w:szCs w:val="24"/>
-              </w:rPr>
-              <w:t xml:space="preserve"> Address:</w:t>
+              <w:t>{{#EventAddressStreet}}Event Address:</w:t>
             </w:r>
           </w:p>
         </w:tc>
@@ -415,61 +329,7 @@
                 <w:sz w:val="24"/>
                 <w:szCs w:val="24"/>
               </w:rPr>
-              <w:t>{{#EventAddressCity</w:t>
-            </w:r>
-            <w:proofErr w:type="gramStart"/>
-            <w:r>
-              <w:rPr>
-                <w:rFonts w:ascii="BC Sans" w:hAnsi="BC Sans"/>
-                <w:sz w:val="24"/>
-                <w:szCs w:val="24"/>
-              </w:rPr>
-              <w:t>}}{</w:t>
-            </w:r>
-            <w:proofErr w:type="gramEnd"/>
-            <w:r>
-              <w:rPr>
-                <w:rFonts w:ascii="BC Sans" w:hAnsi="BC Sans"/>
-                <w:sz w:val="24"/>
-                <w:szCs w:val="24"/>
-              </w:rPr>
-              <w:t>{EventAddressCity</w:t>
-            </w:r>
-            <w:proofErr w:type="gramStart"/>
-            <w:r>
-              <w:rPr>
-                <w:rFonts w:ascii="BC Sans" w:hAnsi="BC Sans"/>
-                <w:sz w:val="24"/>
-                <w:szCs w:val="24"/>
-              </w:rPr>
-              <w:t>}}{</w:t>
-            </w:r>
-            <w:proofErr w:type="gramEnd"/>
-            <w:r>
-              <w:rPr>
-                <w:rFonts w:ascii="BC Sans" w:hAnsi="BC Sans"/>
-                <w:sz w:val="24"/>
-                <w:szCs w:val="24"/>
-              </w:rPr>
-              <w:t>{/EventAddressCity</w:t>
-            </w:r>
-            <w:proofErr w:type="gramStart"/>
-            <w:r>
-              <w:rPr>
-                <w:rFonts w:ascii="BC Sans" w:hAnsi="BC Sans"/>
-                <w:sz w:val="24"/>
-                <w:szCs w:val="24"/>
-              </w:rPr>
-              <w:t>}}{</w:t>
-            </w:r>
-            <w:proofErr w:type="gramEnd"/>
-            <w:r>
-              <w:rPr>
-                <w:rFonts w:ascii="BC Sans" w:hAnsi="BC Sans"/>
-                <w:sz w:val="24"/>
-                <w:szCs w:val="24"/>
-              </w:rPr>
-              <w:t>{#EventAddressState}}, {{</w:t>
+              <w:t>{{#EventAddressCity}}{{EventAddressCity}}{{/EventAddressCity}}{{#EventAddressState}}, {{</w:t>
             </w:r>
             <w:proofErr w:type="spellStart"/>
             <w:r>
@@ -481,23 +341,13 @@
               <w:t>EventAddressState</w:t>
             </w:r>
             <w:proofErr w:type="spellEnd"/>
-            <w:proofErr w:type="gramStart"/>
             <w:r>
               <w:rPr>
                 <w:rFonts w:ascii="BC Sans" w:hAnsi="BC Sans"/>
                 <w:sz w:val="24"/>
                 <w:szCs w:val="24"/>
               </w:rPr>
-              <w:t>}}{</w:t>
-            </w:r>
-            <w:proofErr w:type="gramEnd"/>
-            <w:r>
-              <w:rPr>
-                <w:rFonts w:ascii="BC Sans" w:hAnsi="BC Sans"/>
-                <w:sz w:val="24"/>
-                <w:szCs w:val="24"/>
-              </w:rPr>
-              <w:t>{/</w:t>
+              <w:t>}}{{/</w:t>
             </w:r>
             <w:proofErr w:type="spellStart"/>
             <w:r>
@@ -524,43 +374,7 @@
                 <w:szCs w:val="24"/>
               </w:rPr>
               <w:br/>
-              <w:t>{{#EventAddressPostalCode</w:t>
-            </w:r>
-            <w:proofErr w:type="gramStart"/>
-            <w:r>
-              <w:rPr>
-                <w:rFonts w:ascii="BC Sans" w:hAnsi="BC Sans"/>
-                <w:sz w:val="24"/>
-                <w:szCs w:val="24"/>
-              </w:rPr>
-              <w:t>}}{</w:t>
-            </w:r>
-            <w:proofErr w:type="gramEnd"/>
-            <w:r>
-              <w:rPr>
-                <w:rFonts w:ascii="BC Sans" w:hAnsi="BC Sans"/>
-                <w:sz w:val="24"/>
-                <w:szCs w:val="24"/>
-              </w:rPr>
-              <w:t>{EventAddressPostalCode</w:t>
-            </w:r>
-            <w:proofErr w:type="gramStart"/>
-            <w:r>
-              <w:rPr>
-                <w:rFonts w:ascii="BC Sans" w:hAnsi="BC Sans"/>
-                <w:sz w:val="24"/>
-                <w:szCs w:val="24"/>
-              </w:rPr>
-              <w:t>}}{</w:t>
-            </w:r>
-            <w:proofErr w:type="gramEnd"/>
-            <w:r>
-              <w:rPr>
-                <w:rFonts w:ascii="BC Sans" w:hAnsi="BC Sans"/>
-                <w:sz w:val="24"/>
-                <w:szCs w:val="24"/>
-              </w:rPr>
-              <w:t>{/Ev</w:t>
+              <w:t>{{#EventAddressPostalCode}}{{EventAddressPostalCode}}{{/Ev</w:t>
             </w:r>
             <w:r>
               <w:rPr>
@@ -569,25 +383,7 @@
                 <w:szCs w:val="24"/>
               </w:rPr>
               <w:lastRenderedPageBreak/>
-              <w:t>entAddressPostalCode</w:t>
-            </w:r>
-            <w:proofErr w:type="gramStart"/>
-            <w:r>
-              <w:rPr>
-                <w:rFonts w:ascii="BC Sans" w:hAnsi="BC Sans"/>
-                <w:sz w:val="24"/>
-                <w:szCs w:val="24"/>
-              </w:rPr>
-              <w:t>}}{</w:t>
-            </w:r>
-            <w:proofErr w:type="gramEnd"/>
-            <w:r>
-              <w:rPr>
-                <w:rFonts w:ascii="BC Sans" w:hAnsi="BC Sans"/>
-                <w:sz w:val="24"/>
-                <w:szCs w:val="24"/>
-              </w:rPr>
-              <w:t>{/EventAddressStreet}}</w:t>
+              <w:t>entAddressPostalCode}}{{/EventAddressStreet}}</w:t>
             </w:r>
           </w:p>
         </w:tc>
@@ -620,29 +416,7 @@
                 <w:szCs w:val="24"/>
               </w:rPr>
               <w:lastRenderedPageBreak/>
-              <w:t>{{#BLOrganizationName</w:t>
-            </w:r>
-            <w:proofErr w:type="gramStart"/>
-            <w:r>
-              <w:rPr>
-                <w:rFonts w:ascii="BC Sans" w:hAnsi="BC Sans"/>
-                <w:b/>
-                <w:bCs/>
-                <w:sz w:val="24"/>
-                <w:szCs w:val="24"/>
-              </w:rPr>
-              <w:t>}}Vendor</w:t>
-            </w:r>
-            <w:proofErr w:type="gramEnd"/>
-            <w:r>
-              <w:rPr>
-                <w:rFonts w:ascii="BC Sans" w:hAnsi="BC Sans"/>
-                <w:b/>
-                <w:bCs/>
-                <w:sz w:val="24"/>
-                <w:szCs w:val="24"/>
-              </w:rPr>
-              <w:t>:</w:t>
+              <w:t>{{#BLOrganizationName}}Vendor:</w:t>
             </w:r>
           </w:p>
           <w:p>
@@ -689,23 +463,13 @@
               <w:t>BLOrganizationName</w:t>
             </w:r>
             <w:proofErr w:type="spellEnd"/>
-            <w:proofErr w:type="gramStart"/>
             <w:r>
               <w:rPr>
                 <w:rFonts w:ascii="BC Sans" w:hAnsi="BC Sans"/>
                 <w:sz w:val="24"/>
                 <w:szCs w:val="24"/>
               </w:rPr>
-              <w:t>}}{</w:t>
-            </w:r>
-            <w:proofErr w:type="gramEnd"/>
-            <w:r>
-              <w:rPr>
-                <w:rFonts w:ascii="BC Sans" w:hAnsi="BC Sans"/>
-                <w:sz w:val="24"/>
-                <w:szCs w:val="24"/>
-              </w:rPr>
-              <w:t>{/</w:t>
+              <w:t>}}{{/</w:t>
             </w:r>
             <w:proofErr w:type="spellStart"/>
             <w:r>
@@ -787,32 +551,17 @@
                 <w:sz w:val="24"/>
                 <w:szCs w:val="24"/>
               </w:rPr>
-              <w:t>{{#IF_menuPresent</w:t>
-            </w:r>
-            <w:proofErr w:type="gramStart"/>
-            <w:r>
-              <w:rPr>
-                <w:rFonts w:ascii="BC Sans" w:hAnsi="BC Sans"/>
-                <w:b/>
-                <w:bCs/>
-                <w:sz w:val="24"/>
-                <w:szCs w:val="24"/>
-              </w:rPr>
-              <w:t>}}Approved</w:t>
-            </w:r>
-            <w:proofErr w:type="gramEnd"/>
-            <w:r>
-              <w:rPr>
-                <w:rFonts w:ascii="BC Sans" w:hAnsi="BC Sans"/>
-                <w:b/>
-                <w:bCs/>
-                <w:sz w:val="24"/>
-                <w:szCs w:val="24"/>
-              </w:rPr>
-              <w:t xml:space="preserve"> Menu:</w:t>
+              <w:t>{{#IF_menuPresent}}Approved Menu:</w:t>
             </w:r>
           </w:p>
           <w:p>
+            <w:pPr>
+              <w:pStyle w:val="ListParagraph"/>
+              <w:numPr>
+                <w:ilvl w:val="0"/>
+                <w:numId w:val="25"/>
+              </w:numPr>
+            </w:pPr>
             <w:r>
               <w:rPr>
                 <w:rFonts w:ascii="BC Sans" w:hAnsi="BC Sans"/>
@@ -831,23 +580,13 @@
               <w:t>ApprovedMenuList</w:t>
             </w:r>
             <w:proofErr w:type="spellEnd"/>
-            <w:proofErr w:type="gramStart"/>
             <w:r>
               <w:rPr>
                 <w:rFonts w:ascii="BC Sans" w:hAnsi="BC Sans"/>
                 <w:sz w:val="24"/>
                 <w:szCs w:val="24"/>
               </w:rPr>
-              <w:t>}}{</w:t>
-            </w:r>
-            <w:proofErr w:type="gramEnd"/>
-            <w:r>
-              <w:rPr>
-                <w:rFonts w:ascii="BC Sans" w:hAnsi="BC Sans"/>
-                <w:sz w:val="24"/>
-                <w:szCs w:val="24"/>
-              </w:rPr>
-              <w:t>{/</w:t>
+              <w:t>}}{{/</w:t>
             </w:r>
             <w:proofErr w:type="spellStart"/>
             <w:r>
@@ -903,32 +642,17 @@
                 <w:sz w:val="24"/>
                 <w:szCs w:val="24"/>
               </w:rPr>
-              <w:t>{{#IF_eventPresent</w:t>
-            </w:r>
-            <w:proofErr w:type="gramStart"/>
-            <w:r>
-              <w:rPr>
-                <w:rFonts w:ascii="BC Sans" w:hAnsi="BC Sans"/>
-                <w:b/>
-                <w:bCs/>
-                <w:sz w:val="24"/>
-                <w:szCs w:val="24"/>
-              </w:rPr>
-              <w:t>}}Event</w:t>
-            </w:r>
-            <w:proofErr w:type="gramEnd"/>
-            <w:r>
-              <w:rPr>
-                <w:rFonts w:ascii="BC Sans" w:hAnsi="BC Sans"/>
-                <w:b/>
-                <w:bCs/>
-                <w:sz w:val="24"/>
-                <w:szCs w:val="24"/>
-              </w:rPr>
-              <w:t xml:space="preserve"> Dates:</w:t>
+              <w:t>{{#IF_eventPresent}}Event Dates:</w:t>
             </w:r>
           </w:p>
           <w:p>
+            <w:pPr>
+              <w:pStyle w:val="ListParagraph"/>
+              <w:numPr>
+                <w:ilvl w:val="0"/>
+                <w:numId w:val="25"/>
+              </w:numPr>
+            </w:pPr>
             <w:r>
               <w:rPr>
                 <w:rFonts w:ascii="BC Sans" w:hAnsi="BC Sans"/>
@@ -947,23 +671,13 @@
               <w:t>EventDatesList</w:t>
             </w:r>
             <w:proofErr w:type="spellEnd"/>
-            <w:proofErr w:type="gramStart"/>
             <w:r>
               <w:rPr>
                 <w:rFonts w:ascii="BC Sans" w:hAnsi="BC Sans"/>
                 <w:sz w:val="24"/>
                 <w:szCs w:val="24"/>
               </w:rPr>
-              <w:t>}}{</w:t>
-            </w:r>
-            <w:proofErr w:type="gramEnd"/>
-            <w:r>
-              <w:rPr>
-                <w:rFonts w:ascii="BC Sans" w:hAnsi="BC Sans"/>
-                <w:sz w:val="24"/>
-                <w:szCs w:val="24"/>
-              </w:rPr>
-              <w:t>{/</w:t>
+              <w:t>}}{{/</w:t>
             </w:r>
             <w:proofErr w:type="spellStart"/>
             <w:r>
@@ -1025,29 +739,7 @@
                 <w:sz w:val="24"/>
                 <w:szCs w:val="24"/>
               </w:rPr>
-              <w:t xml:space="preserve">Conditions </w:t>
-            </w:r>
-            <w:proofErr w:type="gramStart"/>
-            <w:r>
-              <w:rPr>
-                <w:rFonts w:ascii="BC Sans" w:hAnsi="BC Sans"/>
-                <w:b/>
-                <w:bCs/>
-                <w:sz w:val="24"/>
-                <w:szCs w:val="24"/>
-              </w:rPr>
-              <w:t>on</w:t>
-            </w:r>
-            <w:proofErr w:type="gramEnd"/>
-            <w:r>
-              <w:rPr>
-                <w:rFonts w:ascii="BC Sans" w:hAnsi="BC Sans"/>
-                <w:b/>
-                <w:bCs/>
-                <w:sz w:val="24"/>
-                <w:szCs w:val="24"/>
-              </w:rPr>
-              <w:t xml:space="preserve"> Permit:</w:t>
+              <w:t>Conditions on Permit:</w:t>
             </w:r>
             <w:r>
               <w:t xml:space="preserve"> </w:t>
@@ -1167,25 +859,7 @@
                 <w:sz w:val="3"/>
                 <w:szCs w:val="3"/>
               </w:rPr>
-              <w:t>{{/Conditions</w:t>
-            </w:r>
-            <w:proofErr w:type="gramStart"/>
-            <w:r>
-              <w:rPr>
-                <w:rFonts w:ascii="BC Sans" w:hAnsi="BC Sans"/>
-                <w:sz w:val="3"/>
-                <w:szCs w:val="3"/>
-              </w:rPr>
-              <w:t>}}{</w:t>
-            </w:r>
-            <w:proofErr w:type="gramEnd"/>
-            <w:r>
-              <w:rPr>
-                <w:rFonts w:ascii="BC Sans" w:hAnsi="BC Sans"/>
-                <w:sz w:val="3"/>
-                <w:szCs w:val="3"/>
-              </w:rPr>
-              <w:t>{/</w:t>
+              <w:t>{{/Conditions}}{{/</w:t>
             </w:r>
             <w:proofErr w:type="spellStart"/>
             <w:r>
@@ -1540,7 +1214,6 @@
             <w:t>IF_HA_Northern</w:t>
           </w:r>
           <w:proofErr w:type="spellEnd"/>
-          <w:proofErr w:type="gramStart"/>
           <w:r>
             <w:rPr>
               <w:kern w:val="2"/>
@@ -1549,18 +1222,7 @@
               <w:lang w:val="en-CA" w:eastAsia="en-CA"/>
               <w14:ligatures w14:val="standardContextual"/>
             </w:rPr>
-            <w:t>}}{</w:t>
-          </w:r>
-          <w:proofErr w:type="gramEnd"/>
-          <w:r>
-            <w:rPr>
-              <w:kern w:val="2"/>
-              <w:sz w:val="10"/>
-              <w:szCs w:val="10"/>
-              <w:lang w:val="en-CA" w:eastAsia="en-CA"/>
-              <w14:ligatures w14:val="standardContextual"/>
-            </w:rPr>
-            <w:t>{#IF_HA_Interior}}</w:t>
+            <w:t>}}{{#IF_HA_Interior}}</w:t>
           </w:r>
           <w:r>
             <w:rPr>
@@ -1628,7 +1290,6 @@
             <w:t>IF_HA_Interior</w:t>
           </w:r>
           <w:proofErr w:type="spellEnd"/>
-          <w:proofErr w:type="gramStart"/>
           <w:r>
             <w:rPr>
               <w:kern w:val="2"/>
@@ -1637,18 +1298,7 @@
               <w:lang w:val="en-CA" w:eastAsia="en-CA"/>
               <w14:ligatures w14:val="standardContextual"/>
             </w:rPr>
-            <w:t>}}{</w:t>
-          </w:r>
-          <w:proofErr w:type="gramEnd"/>
-          <w:r>
-            <w:rPr>
-              <w:kern w:val="2"/>
-              <w:sz w:val="10"/>
-              <w:szCs w:val="10"/>
-              <w:lang w:val="en-CA" w:eastAsia="en-CA"/>
-              <w14:ligatures w14:val="standardContextual"/>
-            </w:rPr>
-            <w:t>{#IF_HA_Island}}</w:t>
+            <w:t>}}{{#IF_HA_Island}}</w:t>
           </w:r>
           <w:r>
             <w:rPr>
@@ -1715,7 +1365,6 @@
             <w:t>IF_HA_Island</w:t>
           </w:r>
           <w:proofErr w:type="spellEnd"/>
-          <w:proofErr w:type="gramStart"/>
           <w:r>
             <w:rPr>
               <w:kern w:val="2"/>
@@ -1724,18 +1373,7 @@
               <w:lang w:val="en-CA" w:eastAsia="en-CA"/>
               <w14:ligatures w14:val="standardContextual"/>
             </w:rPr>
-            <w:t>}}{</w:t>
-          </w:r>
-          <w:proofErr w:type="gramEnd"/>
-          <w:r>
-            <w:rPr>
-              <w:kern w:val="2"/>
-              <w:sz w:val="10"/>
-              <w:szCs w:val="10"/>
-              <w:lang w:val="en-CA" w:eastAsia="en-CA"/>
-              <w14:ligatures w14:val="standardContextual"/>
-            </w:rPr>
-            <w:t>{#IF_HA_VancouverCoastal}}</w:t>
+            <w:t>}}{{#IF_HA_VancouverCoastal}}</w:t>
           </w:r>
           <w:r>
             <w:rPr>
@@ -1989,7 +1627,6 @@
             <w:t>BLIdentifier</w:t>
           </w:r>
           <w:proofErr w:type="spellEnd"/>
-          <w:proofErr w:type="gramStart"/>
           <w:r>
             <w:rPr>
               <w:rFonts w:ascii="BC Sans" w:hAnsi="BC Sans"/>
@@ -1997,17 +1634,7 @@
               <w:sz w:val="26"/>
               <w:szCs w:val="26"/>
             </w:rPr>
-            <w:t>}}{</w:t>
-          </w:r>
-          <w:proofErr w:type="gramEnd"/>
-          <w:r>
-            <w:rPr>
-              <w:rFonts w:ascii="BC Sans" w:hAnsi="BC Sans"/>
-              <w:color w:val="000000"/>
-              <w:sz w:val="26"/>
-              <w:szCs w:val="26"/>
-            </w:rPr>
-            <w:t>{/</w:t>
+            <w:t>}}{{/</w:t>
           </w:r>
           <w:proofErr w:type="spellStart"/>
           <w:r>
@@ -2050,19 +1677,7 @@
               <w:sz w:val="26"/>
               <w:szCs w:val="26"/>
             </w:rPr>
-            <w:t>{{#BLPeriodStart</w:t>
-          </w:r>
-          <w:proofErr w:type="gramStart"/>
-          <w:r>
-            <w:rPr>
-              <w:rFonts w:ascii="BC Sans" w:hAnsi="BC Sans"/>
-              <w:b/>
-              <w:bCs/>
-              <w:color w:val="000000"/>
-              <w:sz w:val="26"/>
-              <w:szCs w:val="26"/>
-            </w:rPr>
-            <w:t>}}</w:t>
+            <w:t>{{#BLPeriodStart}}</w:t>
           </w:r>
           <w:r>
             <w:rPr>
@@ -2075,7 +1690,6 @@
             </w:rPr>
             <w:t>Issued</w:t>
           </w:r>
-          <w:proofErr w:type="gramEnd"/>
           <w:r>
             <w:rPr>
               <w:rFonts w:ascii="BC Sans" w:hAnsi="BC Sans"/>
@@ -2107,7 +1721,6 @@
             <w:t>BLPeriodStart</w:t>
           </w:r>
           <w:proofErr w:type="spellEnd"/>
-          <w:proofErr w:type="gramStart"/>
           <w:r>
             <w:rPr>
               <w:rFonts w:ascii="BC Sans" w:hAnsi="BC Sans"/>
@@ -2115,17 +1728,7 @@
               <w:sz w:val="26"/>
               <w:szCs w:val="26"/>
             </w:rPr>
-            <w:t>}}{</w:t>
-          </w:r>
-          <w:proofErr w:type="gramEnd"/>
-          <w:r>
-            <w:rPr>
-              <w:rFonts w:ascii="BC Sans" w:hAnsi="BC Sans"/>
-              <w:color w:val="000000"/>
-              <w:sz w:val="26"/>
-              <w:szCs w:val="26"/>
-            </w:rPr>
-            <w:t>{/</w:t>
+            <w:t>}}{{/</w:t>
           </w:r>
           <w:proofErr w:type="spellStart"/>
           <w:r>
@@ -2162,31 +1765,7 @@
               <w:sz w:val="26"/>
               <w:szCs w:val="26"/>
             </w:rPr>
-            <w:t>{{#BLPeriodEnd</w:t>
-          </w:r>
-          <w:proofErr w:type="gramStart"/>
-          <w:r>
-            <w:rPr>
-              <w:rFonts w:ascii="BC Sans" w:hAnsi="BC Sans"/>
-              <w:b/>
-              <w:bCs/>
-              <w:color w:val="000000"/>
-              <w:sz w:val="26"/>
-              <w:szCs w:val="26"/>
-            </w:rPr>
-            <w:t>}}Expiry</w:t>
-          </w:r>
-          <w:proofErr w:type="gramEnd"/>
-          <w:r>
-            <w:rPr>
-              <w:rFonts w:ascii="BC Sans" w:hAnsi="BC Sans"/>
-              <w:b/>
-              <w:bCs/>
-              <w:color w:val="000000"/>
-              <w:sz w:val="26"/>
-              <w:szCs w:val="26"/>
-            </w:rPr>
-            <w:t xml:space="preserve"> Date: </w:t>
+            <w:t xml:space="preserve">{{#BLPeriodEnd}}Expiry Date: </w:t>
           </w:r>
           <w:r>
             <w:rPr>
@@ -2208,7 +1787,6 @@
             <w:t>BLPeriodEnd</w:t>
           </w:r>
           <w:proofErr w:type="spellEnd"/>
-          <w:proofErr w:type="gramStart"/>
           <w:r>
             <w:rPr>
               <w:rFonts w:ascii="BC Sans" w:hAnsi="BC Sans"/>
@@ -2216,17 +1794,7 @@
               <w:sz w:val="26"/>
               <w:szCs w:val="26"/>
             </w:rPr>
-            <w:t>}}{</w:t>
-          </w:r>
-          <w:proofErr w:type="gramEnd"/>
-          <w:r>
-            <w:rPr>
-              <w:rFonts w:ascii="BC Sans" w:hAnsi="BC Sans"/>
-              <w:color w:val="000000"/>
-              <w:sz w:val="26"/>
-              <w:szCs w:val="26"/>
-            </w:rPr>
-            <w:t>{/</w:t>
+            <w:t>}}{{/</w:t>
           </w:r>
           <w:proofErr w:type="spellStart"/>
           <w:r>
@@ -2381,19 +1949,7 @@
                     <w:sz w:val="24"/>
                     <w:szCs w:val="24"/>
                   </w:rPr>
-                  <w:t>{{#BLAccountName</w:t>
-                </w:r>
-                <w:proofErr w:type="gramStart"/>
-                <w:r>
-                  <w:rPr>
-                    <w:rFonts w:ascii="BC Sans" w:hAnsi="BC Sans"/>
-                    <w:b/>
-                    <w:bCs/>
-                    <w:color w:val="000000"/>
-                    <w:sz w:val="24"/>
-                    <w:szCs w:val="24"/>
-                  </w:rPr>
-                  <w:t>}}</w:t>
+                  <w:t>{{#BLAccountName}}</w:t>
                 </w:r>
                 <w:r>
                   <w:rPr>
@@ -2404,19 +1960,7 @@
                     <w:sz w:val="24"/>
                     <w:szCs w:val="24"/>
                   </w:rPr>
-                  <w:t>Permit</w:t>
-                </w:r>
-                <w:proofErr w:type="gramEnd"/>
-                <w:r>
-                  <w:rPr>
-                    <w:rFonts w:ascii="BC Sans" w:hAnsi="BC Sans"/>
-                    <w:b/>
-                    <w:bCs/>
-                    <w:color w:val="000000"/>
-                    <w:sz w:val="24"/>
-                    <w:szCs w:val="24"/>
-                  </w:rPr>
-                  <w:t xml:space="preserve"> Issued To:</w:t>
+                  <w:t>Permit Issued To:</w:t>
                 </w:r>
               </w:p>
             </w:tc>
@@ -4347,6 +3891,119 @@
     </w:lvl>
   </w:abstractNum>
   <w:abstractNum w:abstractNumId="23" w15:restartNumberingAfterBreak="0">
+    <w:nsid w:val="745D77C1"/>
+    <w:multiLevelType w:val="hybridMultilevel"/>
+    <w:tmpl w:val="6B262470"/>
+    <w:lvl w:ilvl="0" w:tplc="10090001">
+      <w:start w:val="1"/>
+      <w:numFmt w:val="bullet"/>
+      <w:lvlText w:val=""/>
+      <w:lvlJc w:val="left"/>
+      <w:pPr>
+        <w:ind w:left="720" w:hanging="360"/>
+      </w:pPr>
+      <w:rPr>
+        <w:rFonts w:ascii="Symbol" w:hAnsi="Symbol" w:hint="default"/>
+      </w:rPr>
+    </w:lvl>
+    <w:lvl w:ilvl="1" w:tplc="10090003" w:tentative="1">
+      <w:start w:val="1"/>
+      <w:numFmt w:val="bullet"/>
+      <w:lvlText w:val="o"/>
+      <w:lvlJc w:val="left"/>
+      <w:pPr>
+        <w:ind w:left="1440" w:hanging="360"/>
+      </w:pPr>
+      <w:rPr>
+        <w:rFonts w:ascii="Courier New" w:hAnsi="Courier New" w:cs="Courier New" w:hint="default"/>
+      </w:rPr>
+    </w:lvl>
+    <w:lvl w:ilvl="2" w:tplc="10090005" w:tentative="1">
+      <w:start w:val="1"/>
+      <w:numFmt w:val="bullet"/>
+      <w:lvlText w:val=""/>
+      <w:lvlJc w:val="left"/>
+      <w:pPr>
+        <w:ind w:left="2160" w:hanging="360"/>
+      </w:pPr>
+      <w:rPr>
+        <w:rFonts w:ascii="Wingdings" w:hAnsi="Wingdings" w:hint="default"/>
+      </w:rPr>
+    </w:lvl>
+    <w:lvl w:ilvl="3" w:tplc="10090001" w:tentative="1">
+      <w:start w:val="1"/>
+      <w:numFmt w:val="bullet"/>
+      <w:lvlText w:val=""/>
+      <w:lvlJc w:val="left"/>
+      <w:pPr>
+        <w:ind w:left="2880" w:hanging="360"/>
+      </w:pPr>
+      <w:rPr>
+        <w:rFonts w:ascii="Symbol" w:hAnsi="Symbol" w:hint="default"/>
+      </w:rPr>
+    </w:lvl>
+    <w:lvl w:ilvl="4" w:tplc="10090003" w:tentative="1">
+      <w:start w:val="1"/>
+      <w:numFmt w:val="bullet"/>
+      <w:lvlText w:val="o"/>
+      <w:lvlJc w:val="left"/>
+      <w:pPr>
+        <w:ind w:left="3600" w:hanging="360"/>
+      </w:pPr>
+      <w:rPr>
+        <w:rFonts w:ascii="Courier New" w:hAnsi="Courier New" w:cs="Courier New" w:hint="default"/>
+      </w:rPr>
+    </w:lvl>
+    <w:lvl w:ilvl="5" w:tplc="10090005" w:tentative="1">
+      <w:start w:val="1"/>
+      <w:numFmt w:val="bullet"/>
+      <w:lvlText w:val=""/>
+      <w:lvlJc w:val="left"/>
+      <w:pPr>
+        <w:ind w:left="4320" w:hanging="360"/>
+      </w:pPr>
+      <w:rPr>
+        <w:rFonts w:ascii="Wingdings" w:hAnsi="Wingdings" w:hint="default"/>
+      </w:rPr>
+    </w:lvl>
+    <w:lvl w:ilvl="6" w:tplc="10090001" w:tentative="1">
+      <w:start w:val="1"/>
+      <w:numFmt w:val="bullet"/>
+      <w:lvlText w:val=""/>
+      <w:lvlJc w:val="left"/>
+      <w:pPr>
+        <w:ind w:left="5040" w:hanging="360"/>
+      </w:pPr>
+      <w:rPr>
+        <w:rFonts w:ascii="Symbol" w:hAnsi="Symbol" w:hint="default"/>
+      </w:rPr>
+    </w:lvl>
+    <w:lvl w:ilvl="7" w:tplc="10090003" w:tentative="1">
+      <w:start w:val="1"/>
+      <w:numFmt w:val="bullet"/>
+      <w:lvlText w:val="o"/>
+      <w:lvlJc w:val="left"/>
+      <w:pPr>
+        <w:ind w:left="5760" w:hanging="360"/>
+      </w:pPr>
+      <w:rPr>
+        <w:rFonts w:ascii="Courier New" w:hAnsi="Courier New" w:cs="Courier New" w:hint="default"/>
+      </w:rPr>
+    </w:lvl>
+    <w:lvl w:ilvl="8" w:tplc="10090005" w:tentative="1">
+      <w:start w:val="1"/>
+      <w:numFmt w:val="bullet"/>
+      <w:lvlText w:val=""/>
+      <w:lvlJc w:val="left"/>
+      <w:pPr>
+        <w:ind w:left="6480" w:hanging="360"/>
+      </w:pPr>
+      <w:rPr>
+        <w:rFonts w:ascii="Wingdings" w:hAnsi="Wingdings" w:hint="default"/>
+      </w:rPr>
+    </w:lvl>
+  </w:abstractNum>
+  <w:abstractNum w:abstractNumId="24" w15:restartNumberingAfterBreak="0">
     <w:nsid w:val="7FA400DD"/>
     <w:multiLevelType w:val="multilevel"/>
     <w:tmpl w:val="B380D87C"/>
@@ -4537,10 +4194,13 @@
     <w:abstractNumId w:val="15"/>
   </w:num>
   <w:num w:numId="23" w16cid:durableId="1434786373">
-    <w:abstractNumId w:val="23"/>
+    <w:abstractNumId w:val="24"/>
   </w:num>
   <w:num w:numId="24" w16cid:durableId="489253619">
     <w:abstractNumId w:val="11"/>
+  </w:num>
+  <w:num w:numId="25" w16cid:durableId="1047611676">
+    <w:abstractNumId w:val="23"/>
   </w:num>
 </w:numbering>
 </file>
@@ -16279,6 +15939,30 @@
 </file>
 
 <file path=customXml/item1.xml><?xml version="1.0" encoding="utf-8"?>
+<b:Sources xmlns:b="http://schemas.openxmlformats.org/officeDocument/2006/bibliography" xmlns="http://schemas.openxmlformats.org/officeDocument/2006/bibliography" SelectedStyle="/APA.XSL" StyleName="APA"/>
+</file>
+
+<file path=customXml/item2.xml><?xml version="1.0" encoding="utf-8"?>
+<p:properties xmlns:p="http://schemas.microsoft.com/office/2006/metadata/properties" xmlns:xsi="http://www.w3.org/2001/XMLSchema-instance" xmlns:pc="http://schemas.microsoft.com/office/infopath/2007/PartnerControls">
+  <documentManagement>
+    <lcf76f155ced4ddcb4097134ff3c332f xmlns="94d5cf59-5162-48bc-aa9b-620df72947f5">
+      <Terms xmlns="http://schemas.microsoft.com/office/infopath/2007/PartnerControls"/>
+    </lcf76f155ced4ddcb4097134ff3c332f>
+    <TaxCatchAll xmlns="8350b7c0-334b-4e19-bfc1-744f6a979eee" xsi:nil="true"/>
+  </documentManagement>
+</p:properties>
+</file>
+
+<file path=customXml/item3.xml><?xml version="1.0" encoding="utf-8"?>
+<?mso-contentType ?>
+<FormTemplates xmlns="http://schemas.microsoft.com/sharepoint/v3/contenttype/forms">
+  <Display>DocumentLibraryForm</Display>
+  <Edit>DocumentLibraryForm</Edit>
+  <New>DocumentLibraryForm</New>
+</FormTemplates>
+</file>
+
+<file path=customXml/item4.xml><?xml version="1.0" encoding="utf-8"?>
 <ct:contentTypeSchema xmlns:ct="http://schemas.microsoft.com/office/2006/metadata/contentType" xmlns:ma="http://schemas.microsoft.com/office/2006/metadata/properties/metaAttributes" ct:_="" ma:_="" ma:contentTypeName="Document" ma:contentTypeID="0x01010015F16144C0593A4A82C8AE0B67DB460F" ma:contentTypeVersion="11" ma:contentTypeDescription="Create a new document." ma:contentTypeScope="" ma:versionID="f03428ffc1746d68619392bc270e65d0">
   <xsd:schema xmlns:xsd="http://www.w3.org/2001/XMLSchema" xmlns:xs="http://www.w3.org/2001/XMLSchema" xmlns:p="http://schemas.microsoft.com/office/2006/metadata/properties" xmlns:ns2="94d5cf59-5162-48bc-aa9b-620df72947f5" xmlns:ns3="8350b7c0-334b-4e19-bfc1-744f6a979eee" targetNamespace="http://schemas.microsoft.com/office/2006/metadata/properties" ma:root="true" ma:fieldsID="2206ae29c74f0be434f81d51f34f460d" ns2:_="" ns3:_="">
     <xsd:import namespace="94d5cf59-5162-48bc-aa9b-620df72947f5"/>
@@ -16473,31 +16157,34 @@
 </ct:contentTypeSchema>
 </file>
 
-<file path=customXml/item2.xml><?xml version="1.0" encoding="utf-8"?>
-<?mso-contentType ?>
-<FormTemplates xmlns="http://schemas.microsoft.com/sharepoint/v3/contenttype/forms">
-  <Display>DocumentLibraryForm</Display>
-  <Edit>DocumentLibraryForm</Edit>
-  <New>DocumentLibraryForm</New>
-</FormTemplates>
+<file path=customXml/itemProps1.xml><?xml version="1.0" encoding="utf-8"?>
+<ds:datastoreItem xmlns:ds="http://schemas.openxmlformats.org/officeDocument/2006/customXml" ds:itemID="{EF278816-EC6F-A645-907D-7F25AECB1D4A}">
+  <ds:schemaRefs>
+    <ds:schemaRef ds:uri="http://schemas.openxmlformats.org/officeDocument/2006/bibliography"/>
+  </ds:schemaRefs>
+</ds:datastoreItem>
 </file>
 
-<file path=customXml/item3.xml><?xml version="1.0" encoding="utf-8"?>
-<p:properties xmlns:p="http://schemas.microsoft.com/office/2006/metadata/properties" xmlns:xsi="http://www.w3.org/2001/XMLSchema-instance" xmlns:pc="http://schemas.microsoft.com/office/infopath/2007/PartnerControls">
-  <documentManagement>
-    <lcf76f155ced4ddcb4097134ff3c332f xmlns="94d5cf59-5162-48bc-aa9b-620df72947f5">
-      <Terms xmlns="http://schemas.microsoft.com/office/infopath/2007/PartnerControls"/>
-    </lcf76f155ced4ddcb4097134ff3c332f>
-    <TaxCatchAll xmlns="8350b7c0-334b-4e19-bfc1-744f6a979eee" xsi:nil="true"/>
-  </documentManagement>
-</p:properties>
+<file path=customXml/itemProps2.xml><?xml version="1.0" encoding="utf-8"?>
+<ds:datastoreItem xmlns:ds="http://schemas.openxmlformats.org/officeDocument/2006/customXml" ds:itemID="{A7606A45-B25C-4FBA-BE17-306B7D23C091}">
+  <ds:schemaRefs>
+    <ds:schemaRef ds:uri="http://schemas.microsoft.com/office/2006/metadata/properties"/>
+    <ds:schemaRef ds:uri="http://schemas.microsoft.com/office/infopath/2007/PartnerControls"/>
+    <ds:schemaRef ds:uri="94d5cf59-5162-48bc-aa9b-620df72947f5"/>
+    <ds:schemaRef ds:uri="8350b7c0-334b-4e19-bfc1-744f6a979eee"/>
+  </ds:schemaRefs>
+</ds:datastoreItem>
 </file>
 
-<file path=customXml/item4.xml><?xml version="1.0" encoding="utf-8"?>
-<b:Sources xmlns:b="http://schemas.openxmlformats.org/officeDocument/2006/bibliography" xmlns="http://schemas.openxmlformats.org/officeDocument/2006/bibliography" SelectedStyle="/APA.XSL" StyleName="APA"/>
+<file path=customXml/itemProps3.xml><?xml version="1.0" encoding="utf-8"?>
+<ds:datastoreItem xmlns:ds="http://schemas.openxmlformats.org/officeDocument/2006/customXml" ds:itemID="{360ECE8A-3139-463D-90B6-2A7471686095}">
+  <ds:schemaRefs>
+    <ds:schemaRef ds:uri="http://schemas.microsoft.com/sharepoint/v3/contenttype/forms"/>
+  </ds:schemaRefs>
+</ds:datastoreItem>
 </file>
 
-<file path=customXml/itemProps1.xml><?xml version="1.0" encoding="utf-8"?>
+<file path=customXml/itemProps4.xml><?xml version="1.0" encoding="utf-8"?>
 <ds:datastoreItem xmlns:ds="http://schemas.openxmlformats.org/officeDocument/2006/customXml" ds:itemID="{5B64FE0E-7912-4F95-AAFF-E0C8FB9265FD}">
   <ds:schemaRefs>
     <ds:schemaRef ds:uri="http://schemas.microsoft.com/office/2006/metadata/contentType"/>
@@ -16516,33 +16203,6 @@
 </ds:datastoreItem>
 </file>
 
-<file path=customXml/itemProps2.xml><?xml version="1.0" encoding="utf-8"?>
-<ds:datastoreItem xmlns:ds="http://schemas.openxmlformats.org/officeDocument/2006/customXml" ds:itemID="{360ECE8A-3139-463D-90B6-2A7471686095}">
-  <ds:schemaRefs>
-    <ds:schemaRef ds:uri="http://schemas.microsoft.com/sharepoint/v3/contenttype/forms"/>
-  </ds:schemaRefs>
-</ds:datastoreItem>
-</file>
-
-<file path=customXml/itemProps3.xml><?xml version="1.0" encoding="utf-8"?>
-<ds:datastoreItem xmlns:ds="http://schemas.openxmlformats.org/officeDocument/2006/customXml" ds:itemID="{A7606A45-B25C-4FBA-BE17-306B7D23C091}">
-  <ds:schemaRefs>
-    <ds:schemaRef ds:uri="http://schemas.microsoft.com/office/2006/metadata/properties"/>
-    <ds:schemaRef ds:uri="http://schemas.microsoft.com/office/infopath/2007/PartnerControls"/>
-    <ds:schemaRef ds:uri="94d5cf59-5162-48bc-aa9b-620df72947f5"/>
-    <ds:schemaRef ds:uri="8350b7c0-334b-4e19-bfc1-744f6a979eee"/>
-  </ds:schemaRefs>
-</ds:datastoreItem>
-</file>
-
-<file path=customXml/itemProps4.xml><?xml version="1.0" encoding="utf-8"?>
-<ds:datastoreItem xmlns:ds="http://schemas.openxmlformats.org/officeDocument/2006/customXml" ds:itemID="{EF278816-EC6F-A645-907D-7F25AECB1D4A}">
-  <ds:schemaRefs>
-    <ds:schemaRef ds:uri="http://schemas.openxmlformats.org/officeDocument/2006/bibliography"/>
-  </ds:schemaRefs>
-</ds:datastoreItem>
-</file>
-
 <file path=docMetadata/LabelInfo.xml><?xml version="1.0" encoding="utf-8"?>
 <clbl:labelList xmlns:clbl="http://schemas.microsoft.com/office/2020/mipLabelMetadata">
   <clbl:label id="{ccb6fc37-a1d1-4252-981c-63836d1ca50c}" enabled="1" method="Standard" siteId="{e0793d39-0939-496d-b129-198edd916feb}" removed="0"/>

</xml_diff>